<commit_message>
Update to review draft v1.8
</commit_message>
<xml_diff>
--- a/web-browsers-as-a-pervasive-accessibility-solution.docx
+++ b/web-browsers-as-a-pervasive-accessibility-solution.docx
@@ -51,7 +51,7 @@
         <w:rPr>
           <w:rFonts w:eastAsia="Calibri" w:cs="Calibri"/>
         </w:rPr>
-        <w:t>Version 1.5 (October 2026). Work in progress — a review draft, not for distribution, and subject to peer review for accuracy. Figures and claims are sourced but not yet independently verified by reviewers.</w:t>
+        <w:t>Version 1.8 (October 2026). Work in progress — a review draft, not for distribution, and subject to peer review for accuracy. Figures and claims are sourced but not yet independently verified by reviewers.</w:t>
       </w:r>
     </w:p>
     <w:p>
@@ -11123,6 +11123,64 @@
     </w:p>
     <w:p>
       <w:pPr>
+        <w:pStyle w:val="Heading2"/>
+      </w:pPr>
+      <w:r>
+        <w:t>8.1 Liability and the user-controlled model</w:t>
+      </w:r>
+    </w:p>
+    <w:p>
+      <w:pPr>
+        <w:pStyle w:val="Normal"/>
+      </w:pPr>
+      <w:r>
+        <w:t>A question that arises whenever software changes what a user sees is whether the party making the change takes on legal responsibility for the result. For browser-level accessibility adaptation, the question has two directions: whether adapting a page shifts a site owner’s legal obligations onto the browser vendor, and whether it relieves the site owner of those obligations. This section offers the author’s assessment, not legal advice; the point is to identify the question, not to resolve it.</w:t>
+      </w:r>
+    </w:p>
+    <w:p>
+      <w:pPr>
+        <w:pStyle w:val="Normal"/>
+      </w:pPr>
+      <w:r>
+        <w:t>The obligations in the frameworks this paper examines attach to content and to the entities that provide it. Section 508 binds federal agencies and reaches vendors through procurement; the Web Accessibility Directive and, prospectively, the European Accessibility Act bind covered bodies and economic operators; and litigation under the Americans with Disabilities Act is brought against the covered entity whose service is at issue. In each case the duty runs to the provider of the content or service, not to the user’s software. WCAG itself applies to web content, not to user agents (Section 1.5), and this paper has already noted that user-side aids such as automatically generated image descriptions do not alter the page’s markup, so authors remain responsible for text alternatives under WCAG 1.1.1 (Section 4).</w:t>
+      </w:r>
+    </w:p>
+    <w:p>
+      <w:pPr>
+        <w:pStyle w:val="Normal"/>
+      </w:pPr>
+      <w:r>
+        <w:t>The user-authorized and source-authorized distinction from the Accessibility at the Edge framework (Section 6) is central here. A user-authorized adaptation is one the user invokes, on their own device, for their own use — the same category as a screen reader, browser zoom, forced-colors mode, or a reading view, all of which users already control today without transferring the site owner’s obligations to the browser vendor. A browser that adapts a page at the user’s request is exercising the user’s long-recognized agency over their own experience, not republishing or warranting the site. On that reading, user-controlled browser adaptation does not move the site owner’s legal duty onto the browser, and it is not designed to.</w:t>
+      </w:r>
+    </w:p>
+    <w:p>
+      <w:pPr>
+        <w:pStyle w:val="Normal"/>
+      </w:pPr>
+      <w:r>
+        <w:t>By the same logic, it does not relieve the site owner either. Because the adaptation happens on the user’s device at the user’s option, and may not occur at all for other users, the content as delivered is unchanged; the author’s obligation to provide accessible content is not discharged by the possibility that some users’ browsers will repair it. Browser-level personalization therefore complements author-side conformance rather than replacing it, and the legal pressure that currently drives content remediation is not removed by it.</w:t>
+      </w:r>
+    </w:p>
+    <w:p>
+      <w:pPr>
+        <w:pStyle w:val="Normal"/>
+        <w:pBdr>
+          <w:top w:val="single" w:sz="12" w:space="6" w:color="1F3864"/>
+          <w:left w:val="single" w:sz="12" w:space="6" w:color="1F3864"/>
+          <w:bottom w:val="single" w:sz="12" w:space="6" w:color="1F3864"/>
+          <w:right w:val="single" w:sz="12" w:space="6" w:color="1F3864"/>
+        </w:pBdr>
+        <w:shd w:val="clear" w:color="auto" w:fill="EEF2F8"/>
+        <w:spacing w:before="200" w:after="240"/>
+        <w:ind w:left="180" w:right="180"/>
+        <w:rPr/>
+      </w:pPr>
+      <w:r>
+        <w:t>Author’s assessment: The liability question is best treated as a design constraint, not an obstacle. A capability that is user-initiated, user-controlled, and executed on the user’s own device sits in the established category of assistive technology and user-agent configuration, where the user, not the software vendor, directs the adaptation and the content author’s duties are unchanged. A source-authorized capability — one a site invokes, or one a vendor applies automatically to all users without their direction — raises different and harder questions, which is a further reason this paper favors the user-controlled model. These are the author’s views; the allocation of liability is ultimately a legal question that merits analysis by counsel and by the standards and policy bodies named in Sections 8 and 12.</w:t>
+      </w:r>
+    </w:p>
+    <w:p>
+      <w:pPr>
         <w:pStyle w:val="Heading1"/>
         <w:rPr/>
       </w:pPr>
@@ -20895,6 +20953,22 @@
     </w:p>
     <w:p>
       <w:pPr>
+        <w:pStyle w:val="ListParagraph"/>
+        <w:numPr>
+          <w:ilvl w:val="0"/>
+          <w:numId w:val="5"/>
+        </w:numPr>
+        <w:rPr/>
+      </w:pPr>
+      <w:pPr>
+        <w:pStyle w:val="ListParagraph"/>
+      </w:pPr>
+      <w:r>
+        <w:t>Where does legal responsibility sit when a user’s browser adapts a page for accessibility? If the adaptation is user-initiated and runs on the user’s device, does it leave the content author’s obligations unchanged — as a screen reader or reading view does today — and what, if anything, would change that analysis for a vendor-provided or automatically applied capability?</w:t>
+      </w:r>
+    </w:p>
+    <w:p>
+      <w:pPr>
         <w:pStyle w:val="Heading1"/>
         <w:rPr/>
       </w:pPr>
@@ -24307,7 +24381,7 @@
                 <w:sz w:val="18"/>
                 <w:szCs w:val="18"/>
               </w:rPr>
-              <w:t>TetraLogical</w:t>
+              <w:t>TetraLogical (Steve Faulkner, ed.)</w:t>
             </w:r>
           </w:p>
         </w:tc>
@@ -24335,7 +24409,7 @@
                 <w:sz w:val="18"/>
                 <w:szCs w:val="18"/>
               </w:rPr>
-              <w:t>February to May 2026</w:t>
+              <w:t>Blog July 2025 (updated Aug 2026); lookup updated May 2026</w:t>
             </w:r>
           </w:p>
         </w:tc>
@@ -25929,6 +26003,49 @@
       </w:pPr>
       <w:r>
         <w:rPr>
+          <w:rFonts w:ascii="Calibri" w:cs="Calibri" w:eastAsia="Calibri" w:hAnsi="Calibri"/>
+        </w:rPr>
+        <w:t xml:space="preserve">Faulkner, S. (Ed.). (2026). Screen reader HTML support tables [Blog post and lookup tool]. TetraLogical. Blog posted 10 July 2025, updated 21 August 2026; lookup tool updated 7 May 2026. Retrieved from </w:t>
+      </w:r>
+      <w:hyperlink r:id="rId190" w:history="1">
+        <w:r>
+          <w:rPr>
+            <w:rStyle w:val="Hyperlink"/>
+            <w:rFonts w:ascii="Calibri" w:cs="Calibri" w:eastAsia="Calibri" w:hAnsi="Calibri"/>
+          </w:rPr>
+          <w:t xml:space="preserve">blog post</w:t>
+        </w:r>
+      </w:hyperlink>
+      <w:r>
+        <w:rPr>
+          <w:rFonts w:ascii="Calibri" w:cs="Calibri" w:eastAsia="Calibri" w:hAnsi="Calibri"/>
+        </w:rPr>
+        <w:t xml:space="preserve"> and </w:t>
+      </w:r>
+      <w:hyperlink r:id="rId191" w:history="1">
+        <w:r>
+          <w:rPr>
+            <w:rStyle w:val="Hyperlink"/>
+            <w:rFonts w:ascii="Calibri" w:cs="Calibri" w:eastAsia="Calibri" w:hAnsi="Calibri"/>
+          </w:rPr>
+          <w:t xml:space="preserve">lookup tool</w:t>
+        </w:r>
+      </w:hyperlink>
+      <w:r>
+        <w:rPr>
+          <w:rFonts w:ascii="Calibri" w:cs="Calibri" w:eastAsia="Calibri" w:hAnsi="Calibri"/>
+        </w:rPr>
+        <w:t xml:space="preserve">.</w:t>
+      </w:r>
+    </w:p>
+    <w:p>
+      <w:pPr>
+        <w:pStyle w:val="Normal"/>
+        <w:ind w:hanging="720" w:left="720"/>
+        <w:rPr/>
+      </w:pPr>
+      <w:r>
+        <w:rPr>
           <w:rFonts w:eastAsia="Calibri" w:cs="Calibri"/>
         </w:rPr>
         <w:t xml:space="preserve">Federal Acquisition Regulation. (n.d.). </w:t>
@@ -26379,9 +26496,24 @@
       </w:pPr>
       <w:r>
         <w:rPr>
-          <w:rFonts w:eastAsia="Calibri" w:cs="Calibri"/>
-        </w:rPr>
-        <w:t>Google. (n.d.-j). Prompt API. Chrome for Developers documentation (page last updated 26 August 2026; read 16 October 2026). https://developer.chrome.com/docs/ai/prompt-api</w:t>
+          <w:rFonts w:ascii="Calibri" w:cs="Calibri" w:eastAsia="Calibri" w:hAnsi="Calibri"/>
+        </w:rPr>
+        <w:t xml:space="preserve">Google. (n.d.-j). </w:t>
+      </w:r>
+      <w:hyperlink r:id="rId192" w:history="1">
+        <w:r>
+          <w:rPr>
+            <w:rStyle w:val="Hyperlink"/>
+            <w:rFonts w:ascii="Calibri" w:cs="Calibri" w:eastAsia="Calibri" w:hAnsi="Calibri"/>
+          </w:rPr>
+          <w:t xml:space="preserve">Prompt API</w:t>
+        </w:r>
+      </w:hyperlink>
+      <w:r>
+        <w:rPr>
+          <w:rFonts w:ascii="Calibri" w:cs="Calibri" w:eastAsia="Calibri" w:hAnsi="Calibri"/>
+        </w:rPr>
+        <w:t xml:space="preserve">. Chrome for Developers documentation (page last updated 26 August 2026; read 16 October 2026).</w:t>
       </w:r>
     </w:p>
     <w:p>
@@ -26688,8 +26820,17 @@
         <w:rPr>
           <w:rFonts w:eastAsia="Calibri" w:cs="Calibri"/>
         </w:rPr>
-        <w:t xml:space="preserve"> (pp. 94–101). ACM. https://doi.org/10.1145/228347.228363</w:t>
-      </w:r>
+        <w:t xml:space="preserve"> </w:t>
+      </w:r>
+      <w:hyperlink r:id="rId196" w:history="1">
+        <w:r>
+          <w:rPr>
+            <w:rStyle w:val="Hyperlink"/>
+            <w:rFonts w:ascii="Calibri" w:cs="Calibri" w:eastAsia="Calibri" w:hAnsi="Calibri"/>
+          </w:rPr>
+          <w:t xml:space="preserve">https://doi.org/10.1145/228347.228363</w:t>
+        </w:r>
+      </w:hyperlink>
     </w:p>
     <w:p>
       <w:pPr>
@@ -27863,9 +28004,24 @@
       </w:pPr>
       <w:r>
         <w:rPr>
-          <w:rFonts w:eastAsia="Calibri" w:cs="Calibri"/>
-        </w:rPr>
-        <w:t>Mozilla. (n.d.-i). Prompt API [Standards position, mozilla/standards-positions issue #1213] (read 16 October 2026). GitHub. https://github.com/mozilla/standards-positions/issues/1213</w:t>
+          <w:rFonts w:ascii="Calibri" w:cs="Calibri" w:eastAsia="Calibri" w:hAnsi="Calibri"/>
+        </w:rPr>
+        <w:t xml:space="preserve">Mozilla. (n.d.-i). </w:t>
+      </w:r>
+      <w:hyperlink r:id="rId193" w:history="1">
+        <w:r>
+          <w:rPr>
+            <w:rStyle w:val="Hyperlink"/>
+            <w:rFonts w:ascii="Calibri" w:cs="Calibri" w:eastAsia="Calibri" w:hAnsi="Calibri"/>
+          </w:rPr>
+          <w:t xml:space="preserve">Prompt API [Standards position, mozilla/standards-positions issue #1213]</w:t>
+        </w:r>
+      </w:hyperlink>
+      <w:r>
+        <w:rPr>
+          <w:rFonts w:ascii="Calibri" w:cs="Calibri" w:eastAsia="Calibri" w:hAnsi="Calibri"/>
+        </w:rPr>
+        <w:t xml:space="preserve"> (read 16 October 2026). GitHub.</w:t>
       </w:r>
     </w:p>
     <w:p>
@@ -29306,9 +29462,24 @@
       </w:pPr>
       <w:r>
         <w:rPr>
-          <w:rFonts w:eastAsia="Calibri" w:cs="Calibri"/>
-        </w:rPr>
-        <w:t>W3C TAG. (n.d.-a). Prompt API [Design review, w3ctag/design-reviews issue #1093] (read 16 October 2026). GitHub. https://github.com/w3ctag/design-reviews/issues/1093</w:t>
+          <w:rFonts w:ascii="Calibri" w:cs="Calibri" w:eastAsia="Calibri" w:hAnsi="Calibri"/>
+        </w:rPr>
+        <w:t xml:space="preserve">W3C TAG. (n.d.-a). </w:t>
+      </w:r>
+      <w:hyperlink r:id="rId194" w:history="1">
+        <w:r>
+          <w:rPr>
+            <w:rStyle w:val="Hyperlink"/>
+            <w:rFonts w:ascii="Calibri" w:cs="Calibri" w:eastAsia="Calibri" w:hAnsi="Calibri"/>
+          </w:rPr>
+          <w:t xml:space="preserve">Prompt API [Design review, w3ctag/design-reviews issue #1093]</w:t>
+        </w:r>
+      </w:hyperlink>
+      <w:r>
+        <w:rPr>
+          <w:rFonts w:ascii="Calibri" w:cs="Calibri" w:eastAsia="Calibri" w:hAnsi="Calibri"/>
+        </w:rPr>
+        <w:t xml:space="preserve"> (read 16 October 2026). GitHub.</w:t>
       </w:r>
     </w:p>
     <w:p>
@@ -29601,9 +29772,24 @@
       </w:pPr>
       <w:r>
         <w:rPr>
-          <w:rFonts w:eastAsia="Calibri" w:cs="Calibri"/>
-        </w:rPr>
-        <w:t>WebKit. (n.d.-a). ML Prompt API [Standards position, WebKit/standards-positions issue #495] (read 16 October 2026). GitHub. https://github.com/WebKit/standards-positions/issues/495</w:t>
+          <w:rFonts w:ascii="Calibri" w:cs="Calibri" w:eastAsia="Calibri" w:hAnsi="Calibri"/>
+        </w:rPr>
+        <w:t xml:space="preserve">WebKit. (n.d.-a). </w:t>
+      </w:r>
+      <w:hyperlink r:id="rId195" w:history="1">
+        <w:r>
+          <w:rPr>
+            <w:rStyle w:val="Hyperlink"/>
+            <w:rFonts w:ascii="Calibri" w:cs="Calibri" w:eastAsia="Calibri" w:hAnsi="Calibri"/>
+          </w:rPr>
+          <w:t xml:space="preserve">ML Prompt API [Standards position, WebKit/standards-positions issue #495]</w:t>
+        </w:r>
+      </w:hyperlink>
+      <w:r>
+        <w:rPr>
+          <w:rFonts w:ascii="Calibri" w:cs="Calibri" w:eastAsia="Calibri" w:hAnsi="Calibri"/>
+        </w:rPr>
+        <w:t xml:space="preserve"> (read 16 October 2026). GitHub.</w:t>
       </w:r>
     </w:p>
     <w:p>

</xml_diff>

<commit_message>
Update to v1.10 (Pellegrin review fixes)
</commit_message>
<xml_diff>
--- a/web-browsers-as-a-pervasive-accessibility-solution.docx
+++ b/web-browsers-as-a-pervasive-accessibility-solution.docx
@@ -51,7 +51,7 @@
         <w:rPr>
           <w:rFonts w:eastAsia="Calibri" w:cs="Calibri"/>
         </w:rPr>
-        <w:t>Version 1.8 (October 2026). Work in progress — a review draft, not for distribution, and subject to peer review for accuracy. Figures and claims are sourced but not yet independently verified by reviewers.</w:t>
+        <w:t>Version 1.10 (October 2026). Work in progress — a review draft, not for distribution, and subject to peer review for accuracy. Figures and claims are sourced but not yet independently verified by reviewers.</w:t>
       </w:r>
     </w:p>
     <w:p>
@@ -10608,7 +10608,7 @@
         <w:rPr>
           <w:rFonts w:eastAsia="Calibri" w:cs="Calibri"/>
         </w:rPr>
-        <w:t xml:space="preserve">Evidence that a problem can be </w:t>
+        <w:t>Evidence that a problem can be detected automatically is not evidence that an automated fix is correct for users. The studies cited measure different things (detection rates, rated description quality, and speech-recognition error rates) and are not directly comparable. One such system, AccessGuru, is reported by Fathallah et al. (2025) to have reduced an average accessibility-violation severity score by up to 84% on a 250-case syntax/layout evaluation sample drawn from a collection of roughly 3,500 real violations — a score reduction, not a count of violations fully fixed — while a separate 55-case semantic evaluation reported about 77% average similarity (Sentence-BERT cosine) to human-developer corrections; the authors stress that results still require human review.</w:t>
       </w:r>
       <w:r>
         <w:rPr>
@@ -10616,13 +10616,11 @@
           <w:i/>
           <w:iCs/>
         </w:rPr>
-        <w:t>detected</w:t>
-      </w:r>
-      <w:r>
-        <w:rPr>
-          <w:rFonts w:eastAsia="Calibri" w:cs="Calibri"/>
-        </w:rPr>
-        <w:t xml:space="preserve"> automatically is not evidence that an automated </w:t>
+      </w:r>
+      <w:r>
+        <w:rPr>
+          <w:rFonts w:eastAsia="Calibri" w:cs="Calibri"/>
+        </w:rPr>
       </w:r>
       <w:r>
         <w:rPr>
@@ -10630,13 +10628,11 @@
           <w:i/>
           <w:iCs/>
         </w:rPr>
-        <w:t>fix</w:t>
-      </w:r>
-      <w:r>
-        <w:rPr>
-          <w:rFonts w:eastAsia="Calibri" w:cs="Calibri"/>
-        </w:rPr>
-        <w:t xml:space="preserve"> is correct for users. The studies cited measure different things (detection rates, rated description quality, and speech-recognition error rates) and are not directly comparable. One such system, AccessGuru, is reported by Fathallah et al. (2025) to have reduced an average accessibility-violation severity score by up to 84% across roughly 3,500 real violations — a score reduction, not a count of violations fully fixed — with about 77% similarity to human-developer fixes; the authors stress that results still require human review.</w:t>
+      </w:r>
+      <w:r>
+        <w:rPr>
+          <w:rFonts w:eastAsia="Calibri" w:cs="Calibri"/>
+        </w:rPr>
       </w:r>
     </w:p>
     <w:p>
@@ -12536,7 +12532,7 @@
         <w:rPr>
           <w:rFonts w:eastAsia="Calibri" w:cs="Calibri"/>
         </w:rPr>
-        <w:t>A browser-level accessibility transformation therefore combines a capability the browser has always had — reaching into these three layers — with a new one: a local model able to decide what to change. The reaching-in is not new; it is how extensions and assistive technologies already work. What is new is on-device inference good enough to inform it.</w:t>
+        <w:t>A browser-level accessibility transformation therefore combines a capability the browser has always had — reaching into these three layers — with a new one: a local model able to decide what to change. The reaching-in is not new; it is how extensions and assistive technologies already work. What is new is on-device inference capable of informing it. How good is “good enough” is task-dependent — inferring a missing label or simplifying a passage make different demands — and is bounded by the on-device hardware floor discussed in Section 10.1 and by the prototype’s preliminary, still-to-be-tested status noted in Section 10.3; the claim here is that the capability now exists and merits evaluation, not that any one model already meets a defined accessibility threshold across tasks.</w:t>
       </w:r>
     </w:p>
     <w:p>
@@ -12725,7 +12721,7 @@
         <w:rPr>
           <w:rFonts w:eastAsia="Calibri" w:cs="Calibri"/>
         </w:rPr>
-        <w:t>In the WebKit standards-positions review, a reviewer proposed that WebKit oppose the API and raised that "the API has no user consent mechanism for running inference," that on-device inference can mean "the user pays dearly in battery life and device responsiveness, and sites benefit from free compute," that framing on-device inference "as inherently more private is also misleading," and that "model availability remains a fingerprinting vector." The opening review asked whether the interface "would work well with Apple Intelligence or other WebKit browsers" (WebKit, n.d.-a). As of the date read, this was a proposed resolution, not a confirmed WebKit position.</w:t>
+        <w:t>In the WebKit standards-positions review, a reviewer proposed that WebKit oppose the API and raised that "the API has no user consent mechanism for running inference," that on-device inference can mean "the user pays dearly in battery life and device responsiveness, and sites benefit from free compute," that framing on-device inference "as inherently more private is also misleading," and that "model availability remains a fingerprinting vector." The opening review asked whether the interface "would work well with Apple Intelligence or other WebKit browsers" (WebKit, n.d.-a). The WebKit review subsequently resolved to a position of oppose on the Prompt API proposal; that recorded position concerns this API proposal and not a future browser-level accessibility capability, which remains a separate question. [Editorial note: a reviewer of this paper (M. Pellegrin, 22 October 2026) reports that WebKit/standards-positions issue #495 received the “position: oppose” label and was closed on 27 May 2026; the author will confirm the exact date against the issue before final publication.]</w:t>
       </w:r>
     </w:p>
     <w:p>
@@ -14431,7 +14427,7 @@
         <w:rPr>
           <w:rFonts w:eastAsia="Calibri" w:cs="Calibri"/>
         </w:rPr>
-        <w:t>EN 301 549 adds two smaller workstreams: reviewing authentication flows the browser controls, so that no single biological characteristic is the only means of identification (EN 301 549 clause 5.3), noting that in WebAuthn user verification is performed locally by the authenticator, through modalities such as a PIN, password, or biometric (W3C, 2026d); and supporting real-time text in web communication, for which the IETF has specified T.140 text over WebRTC data channels (RFC 8865; Holmberg &amp; Hellström, 2021).</w:t>
+        <w:t>EN 301 549 adds two smaller workstreams: reviewing authentication flows the browser controls, so that no single biological characteristic is the only means of identification (EN 301 549 clause 5.3), noting that in WebAuthn user verification is performed locally by the authenticator, through modalities such as a PIN, password, or biometric (W3C, 2026d). This workstream matters for accessibility as well as security: some users cannot reliably present a given biometric — for example, a user with no usable fingerprint, a blind user or one with nystagmus for whom an iris or face scan is unreliable, or a non-speaking user for whom voice verification is not an option — so an equally secure, fully accessible verification path must remain available to them. The second workstream supports real-time text in web communication, for which the IETF has specified T.140 text over WebRTC data channels (RFC 8865; Holmberg &amp; Hellström, 2021).</w:t>
       </w:r>
     </w:p>
     <w:p>

</xml_diff>

<commit_message>
Updates to latest version of this session.
</commit_message>
<xml_diff>
--- a/web-browsers-as-a-pervasive-accessibility-solution.docx
+++ b/web-browsers-as-a-pervasive-accessibility-solution.docx
@@ -51,7 +51,7 @@
         <w:rPr>
           <w:rFonts w:eastAsia="Calibri" w:cs="Calibri"/>
         </w:rPr>
-        <w:t>Version 1.10 (October 2026). Work in progress — a review draft, not for distribution, and subject to peer review for accuracy. Figures and claims are sourced but not yet independently verified by reviewers.</w:t>
+        <w:t>Version 1.13 (October 2026). Work in progress — a review draft, not for distribution, and subject to peer review for accuracy. Figures and claims are sourced but not yet independently verified by reviewers.</w:t>
       </w:r>
     </w:p>
     <w:p>
@@ -574,7 +574,7 @@
         <w:rPr>
           <w:rFonts w:eastAsia="Calibri" w:cs="Calibri"/>
         </w:rPr>
-        <w:t>Four findings stand out. First, the engines have converged on similar accessibility architectures and agree closely on how they compute roles and accessible names: in the Interop 2024 accessibility focus area, all four tested browsers finished the year at or above 99.7% in preview builds. Second, browsers already ship many user-side aids, including automatic image descriptions, live captions, reading modes with read-aloud, and color overrides, but each is vendor-specific, uneven across engines, and not driven by standardized user preferences. Third, agreement on what browsers compute does not yet mean that people using screen readers hear the same thing in every browser. The W3C ARIA-AT project tests exactly this: it takes correctly built reference examples of common controls, such as tabs, dialogs, and menus, and checks what JAWS, NVDA, and VoiceOver actually convey with specific browsers (at the Candidate stage, JAWS and NVDA with Chrome, and VoiceOver with Safari). Because the examples are reviewed reference implementations, a failure points to the browser, the screen reader, or the way they interact, rather than to the web author. Only 3 of its test plans have reached the Recommended stage, about half are still at the Candidate stage, none yet covers live regions beyond alerts, and results for composite widgets still differ widely between combinations. Fourth, no current law or standard requires browsers to provide personalized adaptation. Section 508 and EN 301 549 reach browsers mainly through procurement, and the European Accessibility Act does not list standalone browsers.</w:t>
+        <w:t>Four findings stand out. First, the engines have converged on similar accessibility architectures and agree closely on how they compute roles and accessible names: in the Interop 2024 accessibility focus area, all four tested browsers finished the year at or above 99.7% in preview builds. Second, browsers already ship many user-side aids, including automatic image descriptions, live captions, reading modes with read-aloud, and color overrides, but each is vendor-specific, uneven across engines, and not driven by standardized user preferences. Third, agreement on what browsers compute does not yet mean that people using screen readers hear the same thing in every browser. The W3C ARIA-AT project tests exactly this: it takes correctly built reference examples of common controls, such as tabs, dialogs, and menus, and checks what JAWS, NVDA, and VoiceOver actually convey with specific browsers (at the Candidate stage, JAWS and NVDA with Chrome, and VoiceOver with Safari). Because the examples are reviewed reference implementations, a failure points to the browser, the screen reader, or the way they interact, rather than to the web author. Only 3 of its test plans have reached the Recommended stage, about half are still at the Candidate stage, none yet covers live regions beyond alerts, and results for composite widgets still differ widely between combinations. A new effort, the Accessibility Compatibility Dataset (ACD), is beginning to collect exactly this browser-and-assistive-technology support data for developer tools, though it is in early development. Fourth, no current law or standard requires browsers to provide personalized adaptation. Section 508 and EN 301 549 reach browsers mainly through procurement, and the European Accessibility Act does not list standalone browsers.</w:t>
       </w:r>
     </w:p>
     <w:p>
@@ -5025,6 +5025,113 @@
           </w:p>
         </w:tc>
       </w:tr>
+      <w:tr>
+        <w:tc>
+          <w:tcPr>
+            <w:tcW w:w="1882" w:type="dxa"/>
+            <w:tcBorders>
+              <w:top w:val="single" w:sz="4" w:space="0" w:color="808080"/>
+              <w:left w:val="single" w:sz="4" w:space="0" w:color="808080"/>
+              <w:bottom w:val="single" w:sz="4" w:space="0" w:color="808080"/>
+              <w:right w:val="single" w:sz="4" w:space="0" w:color="808080"/>
+            </w:tcBorders>
+          </w:tcPr>
+          <w:p>
+            <w:pPr>
+              <w:pStyle w:val="Normal"/>
+              <w:spacing w:before="0" w:after="0"/>
+              <w:rPr/>
+            </w:pPr>
+            <w:r>
+              <w:t>Always underline links setting</w:t>
+            </w:r>
+          </w:p>
+        </w:tc>
+        <w:tc>
+          <w:tcPr>
+            <w:tcW w:w="1811" w:type="dxa"/>
+            <w:tcBorders>
+              <w:top w:val="single" w:sz="4" w:space="0" w:color="808080"/>
+              <w:left w:val="single" w:sz="4" w:space="0" w:color="808080"/>
+              <w:bottom w:val="single" w:sz="4" w:space="0" w:color="808080"/>
+              <w:right w:val="single" w:sz="4" w:space="0" w:color="808080"/>
+            </w:tcBorders>
+          </w:tcPr>
+          <w:p>
+            <w:pPr>
+              <w:pStyle w:val="Normal"/>
+              <w:spacing w:before="0" w:after="0"/>
+              <w:rPr/>
+            </w:pPr>
+            <w:r>
+              <w:t>No equivalent setting found</w:t>
+            </w:r>
+          </w:p>
+        </w:tc>
+        <w:tc>
+          <w:tcPr>
+            <w:tcW w:w="1880" w:type="dxa"/>
+            <w:tcBorders>
+              <w:top w:val="single" w:sz="4" w:space="0" w:color="808080"/>
+              <w:left w:val="single" w:sz="4" w:space="0" w:color="808080"/>
+              <w:bottom w:val="single" w:sz="4" w:space="0" w:color="808080"/>
+              <w:right w:val="single" w:sz="4" w:space="0" w:color="808080"/>
+            </w:tcBorders>
+          </w:tcPr>
+          <w:p>
+            <w:pPr>
+              <w:pStyle w:val="Normal"/>
+              <w:spacing w:before="0" w:after="0"/>
+              <w:rPr/>
+            </w:pPr>
+            <w:r>
+              <w:t>No equivalent setting found</w:t>
+            </w:r>
+          </w:p>
+        </w:tc>
+        <w:tc>
+          <w:tcPr>
+            <w:tcW w:w="1885" w:type="dxa"/>
+            <w:tcBorders>
+              <w:top w:val="single" w:sz="4" w:space="0" w:color="808080"/>
+              <w:left w:val="single" w:sz="4" w:space="0" w:color="808080"/>
+              <w:bottom w:val="single" w:sz="4" w:space="0" w:color="808080"/>
+              <w:right w:val="single" w:sz="4" w:space="0" w:color="808080"/>
+            </w:tcBorders>
+          </w:tcPr>
+          <w:p>
+            <w:pPr>
+              <w:pStyle w:val="Normal"/>
+              <w:spacing w:before="0" w:after="0"/>
+              <w:rPr/>
+            </w:pPr>
+            <w:r>
+              <w:t>Yes (Firefox 121+, December 2023): Settings &gt; Accessibility &gt; Motion and link styling &gt; Always underline links</w:t>
+            </w:r>
+          </w:p>
+        </w:tc>
+        <w:tc>
+          <w:tcPr>
+            <w:tcW w:w="1902" w:type="dxa"/>
+            <w:tcBorders>
+              <w:top w:val="single" w:sz="4" w:space="0" w:color="808080"/>
+              <w:left w:val="single" w:sz="4" w:space="0" w:color="808080"/>
+              <w:bottom w:val="single" w:sz="4" w:space="0" w:color="808080"/>
+              <w:right w:val="single" w:sz="4" w:space="0" w:color="808080"/>
+            </w:tcBorders>
+          </w:tcPr>
+          <w:p>
+            <w:pPr>
+              <w:pStyle w:val="Normal"/>
+              <w:spacing w:before="0" w:after="0"/>
+              <w:rPr/>
+            </w:pPr>
+            <w:r>
+              <w:t>No equivalent setting found</w:t>
+            </w:r>
+          </w:p>
+        </w:tc>
+      </w:tr>
     </w:tbl>
     <w:p>
       <w:pPr>
@@ -12721,7 +12828,7 @@
         <w:rPr>
           <w:rFonts w:eastAsia="Calibri" w:cs="Calibri"/>
         </w:rPr>
-        <w:t>In the WebKit standards-positions review, a reviewer proposed that WebKit oppose the API and raised that "the API has no user consent mechanism for running inference," that on-device inference can mean "the user pays dearly in battery life and device responsiveness, and sites benefit from free compute," that framing on-device inference "as inherently more private is also misleading," and that "model availability remains a fingerprinting vector." The opening review asked whether the interface "would work well with Apple Intelligence or other WebKit browsers" (WebKit, n.d.-a). The WebKit review subsequently resolved to a position of oppose on the Prompt API proposal; that recorded position concerns this API proposal and not a future browser-level accessibility capability, which remains a separate question. [Editorial note: a reviewer of this paper (M. Pellegrin, 22 October 2026) reports that WebKit/standards-positions issue #495 received the “position: oppose” label and was closed on 27 May 2026; the author will confirm the exact date against the issue before final publication.]</w:t>
+        <w:t>In the WebKit standards-positions review, a reviewer proposed that WebKit oppose the API and raised that "the API has no user consent mechanism for running inference," that on-device inference can mean "the user pays dearly in battery life and device responsiveness, and sites benefit from free compute," that framing on-device inference "as inherently more private is also misleading," and that "model availability remains a fingerprinting vector." The opening review asked whether the interface "would work well with Apple Intelligence or other WebKit browsers" (WebKit, n.d.-a). The WebKit review subsequently resolved to a position of oppose on the Prompt API proposal, and the issue was closed as completed on 26 May 2026; that recorded position concerns this API proposal and not a future browser-level accessibility capability, which remains a separate question.</w:t>
       </w:r>
     </w:p>
     <w:p>
@@ -13586,7 +13693,7 @@
         <w:rPr>
           <w:rFonts w:eastAsia="Calibri" w:cs="Calibri"/>
         </w:rPr>
-        <w:t>Taken together, the documented concerns do not describe an insurmountable objection to browser-level accessibility. They describe the design of a general AI interface — and, read as requirements, they point toward the same thing this paper proposes: a defined, standardized, user-controlled capability rather than open-ended, site-invoked access to a proprietary model. Section 11 sets out the engineering roadmap; Section 12 shows the cost; Section 13 turns both into measurable commitments.</w:t>
+        <w:t>Taken together, the documented concerns do not describe an insurmountable objection to browser-level accessibility. They describe the design of a general AI interface — and, read as requirements, they point toward the same thing this paper proposes: a defined, standardized, user-controlled capability rather than open-ended, site-invoked access to a proprietary model. A further concern, raised in review, is that model-driven adaptation is non-deterministic: the same page could be conveyed differently from one run to the next. This reinforces the case for a defined, versioned, testable capability with conformance tests over open-ended prompting, and for keeping the user in control of when and whether an adaptation is applied. Section 11 sets out the engineering roadmap; Section 12 shows the cost; Section 13 turns both into measurable commitments.</w:t>
       </w:r>
     </w:p>
     <w:p>
@@ -24756,6 +24863,113 @@
           </w:p>
         </w:tc>
       </w:tr>
+      <w:tr>
+        <w:tc>
+          <w:tcPr>
+            <w:tcW w:w="1946" w:type="dxa"/>
+            <w:tcBorders>
+              <w:top w:val="single" w:sz="4" w:space="0" w:color="808080"/>
+              <w:left w:val="single" w:sz="4" w:space="0" w:color="808080"/>
+              <w:bottom w:val="single" w:sz="4" w:space="0" w:color="808080"/>
+              <w:right w:val="single" w:sz="4" w:space="0" w:color="808080"/>
+            </w:tcBorders>
+          </w:tcPr>
+          <w:p>
+            <w:pPr>
+              <w:pStyle w:val="Normal"/>
+              <w:spacing w:before="0" w:after="0"/>
+              <w:rPr/>
+            </w:pPr>
+            <w:r>
+              <w:t>Accessibility Compatibility Dataset (ACD)</w:t>
+            </w:r>
+          </w:p>
+        </w:tc>
+        <w:tc>
+          <w:tcPr>
+            <w:tcW w:w="1919" w:type="dxa"/>
+            <w:tcBorders>
+              <w:top w:val="single" w:sz="4" w:space="0" w:color="808080"/>
+              <w:left w:val="single" w:sz="4" w:space="0" w:color="808080"/>
+              <w:bottom w:val="single" w:sz="4" w:space="0" w:color="808080"/>
+              <w:right w:val="single" w:sz="4" w:space="0" w:color="808080"/>
+            </w:tcBorders>
+          </w:tcPr>
+          <w:p>
+            <w:pPr>
+              <w:pStyle w:val="Normal"/>
+              <w:spacing w:before="0" w:after="0"/>
+              <w:rPr/>
+            </w:pPr>
+            <w:r>
+              <w:t>lola's lab and Scaled Accessibility (with Mozilla, WebDX CG, Baseline, ARIA-AT)</w:t>
+            </w:r>
+          </w:p>
+        </w:tc>
+        <w:tc>
+          <w:tcPr>
+            <w:tcW w:w="1751" w:type="dxa"/>
+            <w:tcBorders>
+              <w:top w:val="single" w:sz="4" w:space="0" w:color="808080"/>
+              <w:left w:val="single" w:sz="4" w:space="0" w:color="808080"/>
+              <w:bottom w:val="single" w:sz="4" w:space="0" w:color="808080"/>
+              <w:right w:val="single" w:sz="4" w:space="0" w:color="808080"/>
+            </w:tcBorders>
+          </w:tcPr>
+          <w:p>
+            <w:pPr>
+              <w:pStyle w:val="Normal"/>
+              <w:spacing w:before="0" w:after="0"/>
+              <w:rPr/>
+            </w:pPr>
+            <w:r>
+              <w:t>Early development (2026)</w:t>
+            </w:r>
+          </w:p>
+        </w:tc>
+        <w:tc>
+          <w:tcPr>
+            <w:tcW w:w="2145" w:type="dxa"/>
+            <w:tcBorders>
+              <w:top w:val="single" w:sz="4" w:space="0" w:color="808080"/>
+              <w:left w:val="single" w:sz="4" w:space="0" w:color="808080"/>
+              <w:bottom w:val="single" w:sz="4" w:space="0" w:color="808080"/>
+              <w:right w:val="single" w:sz="4" w:space="0" w:color="808080"/>
+            </w:tcBorders>
+          </w:tcPr>
+          <w:p>
+            <w:pPr>
+              <w:pStyle w:val="Normal"/>
+              <w:spacing w:before="0" w:after="0"/>
+              <w:rPr/>
+            </w:pPr>
+            <w:r>
+              <w:t>Accessibility-support across browser and assistive-technology combinations, for developer tools</w:t>
+            </w:r>
+          </w:p>
+        </w:tc>
+        <w:tc>
+          <w:tcPr>
+            <w:tcW w:w="1599" w:type="dxa"/>
+            <w:tcBorders>
+              <w:top w:val="single" w:sz="4" w:space="0" w:color="808080"/>
+              <w:left w:val="single" w:sz="4" w:space="0" w:color="808080"/>
+              <w:bottom w:val="single" w:sz="4" w:space="0" w:color="808080"/>
+              <w:right w:val="single" w:sz="4" w:space="0" w:color="808080"/>
+            </w:tcBorders>
+          </w:tcPr>
+          <w:p>
+            <w:pPr>
+              <w:pStyle w:val="Normal"/>
+              <w:spacing w:before="0" w:after="0"/>
+              <w:rPr/>
+            </w:pPr>
+            <w:r>
+              <w:t>Noted as an emerging source; not yet a figure source (early development)</w:t>
+            </w:r>
+          </w:p>
+        </w:tc>
+      </w:tr>
     </w:tbl>
     <w:p>
       <w:pPr>
@@ -24840,7 +25054,7 @@
         <w:rPr>
           <w:rFonts w:eastAsia="Calibri" w:cs="Calibri"/>
         </w:rPr>
-        <w:t xml:space="preserve">Michael G. Paciello has worked in digital accessibility for more than 40 years. He began his career at Digital Equipment Corporation (DEC) in 1982, where he was a Senior Usability and Accessibility Engineer in a department led by the late David L. Stone (d. 1994), DEC’s Vice President of Software Engineering. Stone introduced the concept of Pervasive Accessible Technology (PAT) at the 1991 World Congress on Technology for People with Disabilities — a talk Paciello contributed to, and whose thinking grew out of work the two had done together. Paciello carried that idea forward to the World Wide Web in 1996 (Laux et al., 1996), the lineage this paper extends. He later served as Executive Director of the Yuri Rubinsky Insight Foundation, a partner organization at the 1997 launch of the W3C Web Accessibility Initiative. He is a longtime member of the W3C, the author of </w:t>
+        <w:t>Michael G. Paciello has worked in digital accessibility for more than 40 years. He began his career at Digital Equipment Corporation (DEC) in 1982, where he was a Senior Usability and Accessibility Engineer in a department led by the late David L. Stone (d. 1994), DEC’s Vice President of Software Engineering. Stone introduced the concept of Pervasive Accessible Technology (PAT) in his address “Accessible Technology: A Look Towards the Third Wave” at the 1991 World Congress on Technology for People with Disabilities — a talk Paciello contributed to, and whose thinking grew out of work the two had done together (Paciello, 2000). Paciello carried that idea forward to the World Wide Web in 1996 (Laux et al., 1996), the lineage this paper extends. He later served as Executive Director of the Yuri Rubinsky Insight Foundation, a partner organization at the 1997 launch of the W3C Web Accessibility Initiative. He is a longtime member of the W3C, the author of Web Accessibility for People with Disabilities, and the founder of The Paciello Group (TPG), Open Access Technologies (OAT), and WebABLE.com (recently donated to Knowbility, an Austin-based accessibility non-profit organization).</w:t>
       </w:r>
       <w:r>
         <w:rPr>
@@ -24848,13 +25062,11 @@
           <w:i/>
           <w:iCs/>
         </w:rPr>
-        <w:t>Web Accessibility for People with Disabilities</w:t>
-      </w:r>
-      <w:r>
-        <w:rPr>
-          <w:rFonts w:eastAsia="Calibri" w:cs="Calibri"/>
-        </w:rPr>
-        <w:t>, and the founder of The Paciello Group (TPG), Open Access Technologies (OAT), and WebABLE.com (recently donated to Knowbility, an Austin-based accessibility non-profit organization).</w:t>
+      </w:r>
+      <w:r>
+        <w:rPr>
+          <w:rFonts w:eastAsia="Calibri" w:cs="Calibri"/>
+        </w:rPr>
       </w:r>
     </w:p>
     <w:p>
@@ -28422,6 +28634,24 @@
         <w:rPr>
           <w:rFonts w:eastAsia="Calibri" w:cs="Calibri"/>
         </w:rPr>
+        <w:t>Paciello, M. (2000). Web Accessibility for People with Disabilities. CMP Books.</w:t>
+      </w:r>
+      <w:r>
+        <w:rPr>
+          <w:rFonts w:eastAsia="Calibri" w:cs="Calibri"/>
+        </w:rPr>
+      </w:r>
+    </w:p>
+    <w:p>
+      <w:pPr>
+        <w:pStyle w:val="Normal"/>
+        <w:ind w:hanging="720" w:left="720"/>
+        <w:rPr/>
+      </w:pPr>
+      <w:r>
+        <w:rPr>
+          <w:rFonts w:eastAsia="Calibri" w:cs="Calibri"/>
+        </w:rPr>
         <w:t xml:space="preserve">Servo Project. (2026a, March 31). </w:t>
       </w:r>
       <w:hyperlink r:id="rId120">
@@ -28690,6 +28920,24 @@
           <w:rFonts w:eastAsia="Calibri" w:cs="Calibri"/>
         </w:rPr>
         <w:t>. StatCounter Global Stats.</w:t>
+      </w:r>
+    </w:p>
+    <w:p>
+      <w:pPr>
+        <w:pStyle w:val="Normal"/>
+        <w:ind w:hanging="720" w:left="720"/>
+        <w:rPr/>
+      </w:pPr>
+      <w:r>
+        <w:rPr>
+          <w:rFonts w:eastAsia="Calibri" w:cs="Calibri"/>
+        </w:rPr>
+        <w:t>Stone, D. (1991). Accessible Technology: A Look Towards the Third Wave [Conference address]. World Congress on Technology for People with Disabilities. As documented in Paciello (2000), Web Accessibility for People with Disabilities (Chapter 11, pp. 272–273).</w:t>
+      </w:r>
+      <w:r>
+        <w:rPr>
+          <w:rFonts w:eastAsia="Calibri" w:cs="Calibri"/>
+        </w:rPr>
       </w:r>
     </w:p>
     <w:p>

</xml_diff>